<commit_message>
Docs/support : refléter le refacto raw.activities + deck unique
- Deck de soutenance : build_pptx_dark.py devient le support unique
  (build_pptx.py supprimé). Sortie au nom de livrable OC officiel
  Le_Gall_Morgan_Option_B_1_support_062026.pptx. Contenu mis à jour :
  8 étapes (ajout transform), couche raw = JSON Strava, 12/12 tâches.
- Trame de soutenance : flux raw Strava → staging, 8 étapes, 12 tâches.
- Rapport .docx : schémas raw.activities, flux 8 étapes, format Strava
  (moving_time ≠ elapsed_time), lignage source_activity_id, GE moving<=elapsed.

Co-Authored-By: Claude Opus 4.8 <noreply@anthropic.com>
</commit_message>
<xml_diff>
--- a/docs/Le_Gall_Morgan_Option_B_rapport_062026.docx
+++ b/docs/Le_Gall_Morgan_Option_B_rapport_062026.docx
@@ -502,7 +502,7 @@
         <w:pStyle w:val="ListBullet"/>
       </w:pPr>
       <w:r>
-        <w:t>raw — copie 1:1 des XLSX. Jamais modifiée (audit trail).</w:t>
+        <w:t>raw — copie 1:1 des sources, jamais modifiée (audit trail) : XLSX RH/sport + activities (payload JSON façon API Strava).</w:t>
       </w:r>
     </w:p>
     <w:p>
@@ -555,7 +555,7 @@
           <w:i w:val="0"/>
           <w:sz w:val="22"/>
         </w:rPr>
-        <w:t>Le flow Kestra enchaîne sept étapes : extraction RH, extraction sport, génération des activités (Strava-like), validation géographique, validation qualité Great Expectations, calcul des avantages, notification Slack. Une défaillance à n'importe quelle étape interrompt le flow et déclenche une alerte mail.</w:t>
+        <w:t>Le flow Kestra enchaîne huit étapes : extraction RH, extraction sport, génération des activités au format API Strava dans la couche raw, aplatissement raw→staging, validation géographique, validation qualité Great Expectations, calcul des avantages, notification Slack. Une défaillance à n'importe quelle étape interrompt le flow et déclenche une alerte mail.</w:t>
       </w:r>
     </w:p>
     <w:p>
@@ -606,7 +606,7 @@
         <w:pStyle w:val="ListBullet"/>
       </w:pPr>
       <w:r>
-        <w:t>Activités sportives — générées par src/generate/activities.py (Faker + numpy) sur les 12 derniers mois, environ 4 000 lignes, cohérentes avec le sport déclaré de chaque salarié.</w:t>
+        <w:t>Activités sportives — générées par src/generate/activities.py (Faker + numpy) au format de l'API Strava (moving_time ≠ elapsed_time, start_date locale) dans raw.activities, puis aplaties vers staging.activities par src/transform/activities.py. Environ 4 000 lignes sur 12 mois, cohérentes avec le sport déclaré de chaque salarié.</w:t>
       </w:r>
     </w:p>
     <w:p>
@@ -744,7 +744,7 @@
         <w:pStyle w:val="ListBullet"/>
       </w:pPr>
       <w:r>
-        <w:t>Clés étrangères vérifiées (id_employee de staging.activities doit exister).</w:t>
+        <w:t>Clés étrangères vérifiées : id_employee de staging.activities, et source_activity_id → raw.activities (lignage raw→staging).</w:t>
       </w:r>
     </w:p>
     <w:p>
@@ -797,7 +797,7 @@
         <w:pStyle w:val="ListBullet"/>
       </w:pPr>
       <w:r>
-        <w:t>Dates d'activités non futures, distance ∈ [0, 200 km].</w:t>
+        <w:t>Dates d'activités non futures, distance ∈ [0, 200 km], moving_time ≤ elapsed_time.</w:t>
       </w:r>
     </w:p>
     <w:p>
@@ -1191,7 +1191,7 @@
         <w:pStyle w:val="ListBullet"/>
       </w:pPr>
       <w:r>
-        <w:t>INSERT manuel dans staging.activities (script ou SQL direct).</w:t>
+        <w:t>INSERT d'une activité (raw.activities puis transform, ou SQL direct en staging pour la démo).</w:t>
       </w:r>
     </w:p>
     <w:p>
@@ -1242,7 +1242,7 @@
         <w:pStyle w:val="ListBullet"/>
       </w:pPr>
       <w:r>
-        <w:t>Pas d'intégration vraie Strava (générateur Faker + numpy à la place).</w:t>
+        <w:t>Pas d'intégration live à l'API Strava (générateur produisant le format Strava à la place).</w:t>
       </w:r>
     </w:p>
     <w:p>

</xml_diff>